<commit_message>
added changes mentioned as per the last comments
</commit_message>
<xml_diff>
--- a/Trend/Devops-CICD-Project2.docx
+++ b/Trend/Devops-CICD-Project2.docx
@@ -1534,7 +1534,15 @@
         <w:pStyle w:val="ListParagraph"/>
       </w:pPr>
       <w:r>
-        <w:t xml:space="preserve">        stage('Build Docker Image') {</w:t>
+        <w:t xml:space="preserve">        </w:t>
+      </w:r>
+      <w:proofErr w:type="gramStart"/>
+      <w:r>
+        <w:t>stage(</w:t>
+      </w:r>
+      <w:proofErr w:type="gramEnd"/>
+      <w:r>
+        <w:t>'Build Docker Image') {</w:t>
       </w:r>
     </w:p>
     <w:p>
@@ -1627,7 +1635,15 @@
         <w:pStyle w:val="ListParagraph"/>
       </w:pPr>
       <w:r>
-        <w:t xml:space="preserve">        stage('Push Image') {</w:t>
+        <w:t xml:space="preserve">        </w:t>
+      </w:r>
+      <w:proofErr w:type="gramStart"/>
+      <w:r>
+        <w:t>stage(</w:t>
+      </w:r>
+      <w:proofErr w:type="gramEnd"/>
+      <w:r>
+        <w:t>'Push Image') {</w:t>
       </w:r>
     </w:p>
     <w:p>
@@ -1646,14 +1662,20 @@
         <w:t xml:space="preserve">                </w:t>
       </w:r>
       <w:proofErr w:type="spellStart"/>
+      <w:proofErr w:type="gramStart"/>
       <w:r>
         <w:t>withCredentials</w:t>
       </w:r>
       <w:proofErr w:type="spellEnd"/>
       <w:r>
-        <w:t>([</w:t>
+        <w:t>(</w:t>
+      </w:r>
+      <w:proofErr w:type="gramEnd"/>
+      <w:r>
+        <w:t>[</w:t>
       </w:r>
       <w:proofErr w:type="spellStart"/>
+      <w:proofErr w:type="gramStart"/>
       <w:r>
         <w:t>usernamePassword</w:t>
       </w:r>
@@ -1661,6 +1683,7 @@
       <w:r>
         <w:t>(</w:t>
       </w:r>
+      <w:proofErr w:type="gramEnd"/>
     </w:p>
     <w:p>
       <w:pPr>
@@ -1789,7 +1812,15 @@
         <w:pStyle w:val="ListParagraph"/>
       </w:pPr>
       <w:r>
-        <w:t xml:space="preserve">        stage('Deploy to EKS') {</w:t>
+        <w:t xml:space="preserve">        </w:t>
+      </w:r>
+      <w:proofErr w:type="gramStart"/>
+      <w:r>
+        <w:t>stage(</w:t>
+      </w:r>
+      <w:proofErr w:type="gramEnd"/>
+      <w:r>
+        <w:t>'Deploy to EKS') {</w:t>
       </w:r>
     </w:p>
     <w:p>
@@ -2088,6 +2119,613 @@
           <w:bCs/>
         </w:rPr>
       </w:pPr>
+      <w:r>
+        <w:rPr>
+          <w:b/>
+          <w:bCs/>
+        </w:rPr>
+        <w:drawing>
+          <wp:inline distT="0" distB="0" distL="0" distR="0" wp14:anchorId="6EB65C97" wp14:editId="650B0590">
+            <wp:extent cx="5731510" cy="2048510"/>
+            <wp:effectExtent l="0" t="0" r="2540" b="8890"/>
+            <wp:docPr id="282044772" name="Picture 1"/>
+            <wp:cNvGraphicFramePr>
+              <a:graphicFrameLocks xmlns:a="http://schemas.openxmlformats.org/drawingml/2006/main" noChangeAspect="1"/>
+            </wp:cNvGraphicFramePr>
+            <a:graphic xmlns:a="http://schemas.openxmlformats.org/drawingml/2006/main">
+              <a:graphicData uri="http://schemas.openxmlformats.org/drawingml/2006/picture">
+                <pic:pic xmlns:pic="http://schemas.openxmlformats.org/drawingml/2006/picture">
+                  <pic:nvPicPr>
+                    <pic:cNvPr id="282044772" name=""/>
+                    <pic:cNvPicPr/>
+                  </pic:nvPicPr>
+                  <pic:blipFill>
+                    <a:blip r:embed="rId24"/>
+                    <a:stretch>
+                      <a:fillRect/>
+                    </a:stretch>
+                  </pic:blipFill>
+                  <pic:spPr>
+                    <a:xfrm>
+                      <a:off x="0" y="0"/>
+                      <a:ext cx="5731510" cy="2048510"/>
+                    </a:xfrm>
+                    <a:prstGeom prst="rect">
+                      <a:avLst/>
+                    </a:prstGeom>
+                  </pic:spPr>
+                </pic:pic>
+              </a:graphicData>
+            </a:graphic>
+          </wp:inline>
+        </w:drawing>
+      </w:r>
+    </w:p>
+    <w:p>
+      <w:pPr>
+        <w:rPr>
+          <w:b/>
+          <w:bCs/>
+        </w:rPr>
+      </w:pPr>
+    </w:p>
+    <w:p>
+      <w:pPr>
+        <w:rPr>
+          <w:b/>
+          <w:bCs/>
+        </w:rPr>
+      </w:pPr>
+      <w:r>
+        <w:rPr>
+          <w:b/>
+          <w:bCs/>
+        </w:rPr>
+        <w:t>Stage Clone:</w:t>
+      </w:r>
+    </w:p>
+    <w:p>
+      <w:pPr>
+        <w:rPr>
+          <w:b/>
+          <w:bCs/>
+        </w:rPr>
+      </w:pPr>
+      <w:r>
+        <w:rPr>
+          <w:b/>
+          <w:bCs/>
+        </w:rPr>
+        <w:drawing>
+          <wp:inline distT="0" distB="0" distL="0" distR="0" wp14:anchorId="72E15720" wp14:editId="49D86375">
+            <wp:extent cx="5195455" cy="2507932"/>
+            <wp:effectExtent l="0" t="0" r="5715" b="6985"/>
+            <wp:docPr id="43733717" name="Picture 1"/>
+            <wp:cNvGraphicFramePr>
+              <a:graphicFrameLocks xmlns:a="http://schemas.openxmlformats.org/drawingml/2006/main" noChangeAspect="1"/>
+            </wp:cNvGraphicFramePr>
+            <a:graphic xmlns:a="http://schemas.openxmlformats.org/drawingml/2006/main">
+              <a:graphicData uri="http://schemas.openxmlformats.org/drawingml/2006/picture">
+                <pic:pic xmlns:pic="http://schemas.openxmlformats.org/drawingml/2006/picture">
+                  <pic:nvPicPr>
+                    <pic:cNvPr id="43733717" name=""/>
+                    <pic:cNvPicPr/>
+                  </pic:nvPicPr>
+                  <pic:blipFill>
+                    <a:blip r:embed="rId25"/>
+                    <a:stretch>
+                      <a:fillRect/>
+                    </a:stretch>
+                  </pic:blipFill>
+                  <pic:spPr>
+                    <a:xfrm>
+                      <a:off x="0" y="0"/>
+                      <a:ext cx="5198961" cy="2509624"/>
+                    </a:xfrm>
+                    <a:prstGeom prst="rect">
+                      <a:avLst/>
+                    </a:prstGeom>
+                  </pic:spPr>
+                </pic:pic>
+              </a:graphicData>
+            </a:graphic>
+          </wp:inline>
+        </w:drawing>
+      </w:r>
+    </w:p>
+    <w:p>
+      <w:pPr>
+        <w:rPr>
+          <w:b/>
+          <w:bCs/>
+        </w:rPr>
+      </w:pPr>
+      <w:proofErr w:type="spellStart"/>
+      <w:proofErr w:type="gramStart"/>
+      <w:r>
+        <w:rPr>
+          <w:b/>
+          <w:bCs/>
+        </w:rPr>
+        <w:lastRenderedPageBreak/>
+        <w:t>Stage:Build</w:t>
+      </w:r>
+      <w:proofErr w:type="spellEnd"/>
+      <w:proofErr w:type="gramEnd"/>
+      <w:r>
+        <w:rPr>
+          <w:b/>
+          <w:bCs/>
+        </w:rPr>
+        <w:t xml:space="preserve"> Docker image </w:t>
+      </w:r>
+      <w:r>
+        <w:rPr>
+          <w:b/>
+          <w:bCs/>
+        </w:rPr>
+        <w:br/>
+      </w:r>
+      <w:r>
+        <w:rPr>
+          <w:b/>
+          <w:bCs/>
+        </w:rPr>
+        <w:br/>
+      </w:r>
+      <w:r>
+        <w:rPr>
+          <w:b/>
+          <w:bCs/>
+        </w:rPr>
+        <w:drawing>
+          <wp:inline distT="0" distB="0" distL="0" distR="0" wp14:anchorId="0D6C4AA9" wp14:editId="0E78EFFE">
+            <wp:extent cx="5731510" cy="2868930"/>
+            <wp:effectExtent l="0" t="0" r="2540" b="7620"/>
+            <wp:docPr id="1702580944" name="Picture 1"/>
+            <wp:cNvGraphicFramePr>
+              <a:graphicFrameLocks xmlns:a="http://schemas.openxmlformats.org/drawingml/2006/main" noChangeAspect="1"/>
+            </wp:cNvGraphicFramePr>
+            <a:graphic xmlns:a="http://schemas.openxmlformats.org/drawingml/2006/main">
+              <a:graphicData uri="http://schemas.openxmlformats.org/drawingml/2006/picture">
+                <pic:pic xmlns:pic="http://schemas.openxmlformats.org/drawingml/2006/picture">
+                  <pic:nvPicPr>
+                    <pic:cNvPr id="1702580944" name=""/>
+                    <pic:cNvPicPr/>
+                  </pic:nvPicPr>
+                  <pic:blipFill>
+                    <a:blip r:embed="rId26"/>
+                    <a:stretch>
+                      <a:fillRect/>
+                    </a:stretch>
+                  </pic:blipFill>
+                  <pic:spPr>
+                    <a:xfrm>
+                      <a:off x="0" y="0"/>
+                      <a:ext cx="5731510" cy="2868930"/>
+                    </a:xfrm>
+                    <a:prstGeom prst="rect">
+                      <a:avLst/>
+                    </a:prstGeom>
+                  </pic:spPr>
+                </pic:pic>
+              </a:graphicData>
+            </a:graphic>
+          </wp:inline>
+        </w:drawing>
+      </w:r>
+    </w:p>
+    <w:p>
+      <w:pPr>
+        <w:rPr>
+          <w:b/>
+          <w:bCs/>
+        </w:rPr>
+      </w:pPr>
+      <w:r>
+        <w:rPr>
+          <w:b/>
+          <w:bCs/>
+        </w:rPr>
+        <w:drawing>
+          <wp:inline distT="0" distB="0" distL="0" distR="0" wp14:anchorId="509B9866" wp14:editId="7C325293">
+            <wp:extent cx="5731510" cy="1561465"/>
+            <wp:effectExtent l="0" t="0" r="2540" b="635"/>
+            <wp:docPr id="1622382472" name="Picture 1"/>
+            <wp:cNvGraphicFramePr>
+              <a:graphicFrameLocks xmlns:a="http://schemas.openxmlformats.org/drawingml/2006/main" noChangeAspect="1"/>
+            </wp:cNvGraphicFramePr>
+            <a:graphic xmlns:a="http://schemas.openxmlformats.org/drawingml/2006/main">
+              <a:graphicData uri="http://schemas.openxmlformats.org/drawingml/2006/picture">
+                <pic:pic xmlns:pic="http://schemas.openxmlformats.org/drawingml/2006/picture">
+                  <pic:nvPicPr>
+                    <pic:cNvPr id="1622382472" name=""/>
+                    <pic:cNvPicPr/>
+                  </pic:nvPicPr>
+                  <pic:blipFill>
+                    <a:blip r:embed="rId27"/>
+                    <a:stretch>
+                      <a:fillRect/>
+                    </a:stretch>
+                  </pic:blipFill>
+                  <pic:spPr>
+                    <a:xfrm>
+                      <a:off x="0" y="0"/>
+                      <a:ext cx="5731510" cy="1561465"/>
+                    </a:xfrm>
+                    <a:prstGeom prst="rect">
+                      <a:avLst/>
+                    </a:prstGeom>
+                  </pic:spPr>
+                </pic:pic>
+              </a:graphicData>
+            </a:graphic>
+          </wp:inline>
+        </w:drawing>
+      </w:r>
+    </w:p>
+    <w:p>
+      <w:pPr>
+        <w:rPr>
+          <w:b/>
+          <w:bCs/>
+        </w:rPr>
+      </w:pPr>
+    </w:p>
+    <w:p>
+      <w:pPr>
+        <w:rPr>
+          <w:b/>
+          <w:bCs/>
+        </w:rPr>
+      </w:pPr>
+    </w:p>
+    <w:p>
+      <w:pPr>
+        <w:rPr>
+          <w:b/>
+          <w:bCs/>
+        </w:rPr>
+      </w:pPr>
+    </w:p>
+    <w:p>
+      <w:pPr>
+        <w:rPr>
+          <w:b/>
+          <w:bCs/>
+        </w:rPr>
+      </w:pPr>
+    </w:p>
+    <w:p>
+      <w:pPr>
+        <w:rPr>
+          <w:b/>
+          <w:bCs/>
+        </w:rPr>
+      </w:pPr>
+    </w:p>
+    <w:p>
+      <w:pPr>
+        <w:rPr>
+          <w:b/>
+          <w:bCs/>
+        </w:rPr>
+      </w:pPr>
+    </w:p>
+    <w:p>
+      <w:pPr>
+        <w:rPr>
+          <w:b/>
+          <w:bCs/>
+        </w:rPr>
+      </w:pPr>
+    </w:p>
+    <w:p>
+      <w:pPr>
+        <w:rPr>
+          <w:b/>
+          <w:bCs/>
+        </w:rPr>
+      </w:pPr>
+    </w:p>
+    <w:p>
+      <w:pPr>
+        <w:rPr>
+          <w:b/>
+          <w:bCs/>
+        </w:rPr>
+      </w:pPr>
+    </w:p>
+    <w:p>
+      <w:pPr>
+        <w:rPr>
+          <w:b/>
+          <w:bCs/>
+        </w:rPr>
+      </w:pPr>
+    </w:p>
+    <w:p>
+      <w:pPr>
+        <w:rPr>
+          <w:b/>
+          <w:bCs/>
+        </w:rPr>
+      </w:pPr>
+    </w:p>
+    <w:p>
+      <w:pPr>
+        <w:rPr>
+          <w:b/>
+          <w:bCs/>
+        </w:rPr>
+      </w:pPr>
+    </w:p>
+    <w:p>
+      <w:pPr>
+        <w:rPr>
+          <w:b/>
+          <w:bCs/>
+        </w:rPr>
+      </w:pPr>
+    </w:p>
+    <w:p>
+      <w:pPr>
+        <w:rPr>
+          <w:b/>
+          <w:bCs/>
+        </w:rPr>
+      </w:pPr>
+      <w:r>
+        <w:rPr>
+          <w:b/>
+          <w:bCs/>
+        </w:rPr>
+        <w:lastRenderedPageBreak/>
+        <w:t>Stage: Docker push</w:t>
+      </w:r>
+    </w:p>
+    <w:p>
+      <w:pPr>
+        <w:rPr>
+          <w:b/>
+          <w:bCs/>
+        </w:rPr>
+      </w:pPr>
+      <w:r>
+        <w:rPr>
+          <w:b/>
+          <w:bCs/>
+        </w:rPr>
+        <w:drawing>
+          <wp:inline distT="0" distB="0" distL="0" distR="0" wp14:anchorId="3196C338" wp14:editId="797EDB50">
+            <wp:extent cx="5334000" cy="3305236"/>
+            <wp:effectExtent l="0" t="0" r="0" b="9525"/>
+            <wp:docPr id="176263676" name="Picture 1"/>
+            <wp:cNvGraphicFramePr>
+              <a:graphicFrameLocks xmlns:a="http://schemas.openxmlformats.org/drawingml/2006/main" noChangeAspect="1"/>
+            </wp:cNvGraphicFramePr>
+            <a:graphic xmlns:a="http://schemas.openxmlformats.org/drawingml/2006/main">
+              <a:graphicData uri="http://schemas.openxmlformats.org/drawingml/2006/picture">
+                <pic:pic xmlns:pic="http://schemas.openxmlformats.org/drawingml/2006/picture">
+                  <pic:nvPicPr>
+                    <pic:cNvPr id="176263676" name=""/>
+                    <pic:cNvPicPr/>
+                  </pic:nvPicPr>
+                  <pic:blipFill>
+                    <a:blip r:embed="rId28"/>
+                    <a:stretch>
+                      <a:fillRect/>
+                    </a:stretch>
+                  </pic:blipFill>
+                  <pic:spPr>
+                    <a:xfrm>
+                      <a:off x="0" y="0"/>
+                      <a:ext cx="5337397" cy="3307341"/>
+                    </a:xfrm>
+                    <a:prstGeom prst="rect">
+                      <a:avLst/>
+                    </a:prstGeom>
+                  </pic:spPr>
+                </pic:pic>
+              </a:graphicData>
+            </a:graphic>
+          </wp:inline>
+        </w:drawing>
+      </w:r>
+    </w:p>
+    <w:p>
+      <w:pPr>
+        <w:rPr>
+          <w:b/>
+          <w:bCs/>
+        </w:rPr>
+      </w:pPr>
+      <w:r>
+        <w:rPr>
+          <w:b/>
+          <w:bCs/>
+        </w:rPr>
+        <w:drawing>
+          <wp:inline distT="0" distB="0" distL="0" distR="0" wp14:anchorId="52D70370" wp14:editId="1DABAEBD">
+            <wp:extent cx="5731510" cy="2710180"/>
+            <wp:effectExtent l="0" t="0" r="2540" b="0"/>
+            <wp:docPr id="702128964" name="Picture 1"/>
+            <wp:cNvGraphicFramePr>
+              <a:graphicFrameLocks xmlns:a="http://schemas.openxmlformats.org/drawingml/2006/main" noChangeAspect="1"/>
+            </wp:cNvGraphicFramePr>
+            <a:graphic xmlns:a="http://schemas.openxmlformats.org/drawingml/2006/main">
+              <a:graphicData uri="http://schemas.openxmlformats.org/drawingml/2006/picture">
+                <pic:pic xmlns:pic="http://schemas.openxmlformats.org/drawingml/2006/picture">
+                  <pic:nvPicPr>
+                    <pic:cNvPr id="702128964" name=""/>
+                    <pic:cNvPicPr/>
+                  </pic:nvPicPr>
+                  <pic:blipFill>
+                    <a:blip r:embed="rId29"/>
+                    <a:stretch>
+                      <a:fillRect/>
+                    </a:stretch>
+                  </pic:blipFill>
+                  <pic:spPr>
+                    <a:xfrm>
+                      <a:off x="0" y="0"/>
+                      <a:ext cx="5731510" cy="2710180"/>
+                    </a:xfrm>
+                    <a:prstGeom prst="rect">
+                      <a:avLst/>
+                    </a:prstGeom>
+                  </pic:spPr>
+                </pic:pic>
+              </a:graphicData>
+            </a:graphic>
+          </wp:inline>
+        </w:drawing>
+      </w:r>
+    </w:p>
+    <w:p>
+      <w:pPr>
+        <w:rPr>
+          <w:b/>
+          <w:bCs/>
+        </w:rPr>
+      </w:pPr>
+    </w:p>
+    <w:p>
+      <w:pPr>
+        <w:rPr>
+          <w:b/>
+          <w:bCs/>
+        </w:rPr>
+      </w:pPr>
+    </w:p>
+    <w:p>
+      <w:pPr>
+        <w:rPr>
+          <w:b/>
+          <w:bCs/>
+        </w:rPr>
+      </w:pPr>
+    </w:p>
+    <w:p>
+      <w:pPr>
+        <w:rPr>
+          <w:b/>
+          <w:bCs/>
+        </w:rPr>
+      </w:pPr>
+    </w:p>
+    <w:p>
+      <w:pPr>
+        <w:rPr>
+          <w:b/>
+          <w:bCs/>
+        </w:rPr>
+      </w:pPr>
+    </w:p>
+    <w:p>
+      <w:pPr>
+        <w:rPr>
+          <w:b/>
+          <w:bCs/>
+        </w:rPr>
+      </w:pPr>
+    </w:p>
+    <w:p>
+      <w:pPr>
+        <w:rPr>
+          <w:b/>
+          <w:bCs/>
+        </w:rPr>
+      </w:pPr>
+    </w:p>
+    <w:p>
+      <w:pPr>
+        <w:rPr>
+          <w:b/>
+          <w:bCs/>
+        </w:rPr>
+      </w:pPr>
+    </w:p>
+    <w:p>
+      <w:pPr>
+        <w:rPr>
+          <w:b/>
+          <w:bCs/>
+        </w:rPr>
+      </w:pPr>
+      <w:r>
+        <w:rPr>
+          <w:b/>
+          <w:bCs/>
+        </w:rPr>
+        <w:lastRenderedPageBreak/>
+        <w:t>Stage: EKS deployment via Jenkins</w:t>
+      </w:r>
+    </w:p>
+    <w:p>
+      <w:pPr>
+        <w:rPr>
+          <w:b/>
+          <w:bCs/>
+        </w:rPr>
+      </w:pPr>
+    </w:p>
+    <w:p>
+      <w:pPr>
+        <w:rPr>
+          <w:b/>
+          <w:bCs/>
+        </w:rPr>
+      </w:pPr>
+      <w:r>
+        <w:rPr>
+          <w:b/>
+          <w:bCs/>
+        </w:rPr>
+        <w:drawing>
+          <wp:inline distT="0" distB="0" distL="0" distR="0" wp14:anchorId="4E0E705D" wp14:editId="7167D0F8">
+            <wp:extent cx="5731510" cy="2442845"/>
+            <wp:effectExtent l="0" t="0" r="2540" b="0"/>
+            <wp:docPr id="1658686537" name="Picture 1"/>
+            <wp:cNvGraphicFramePr>
+              <a:graphicFrameLocks xmlns:a="http://schemas.openxmlformats.org/drawingml/2006/main" noChangeAspect="1"/>
+            </wp:cNvGraphicFramePr>
+            <a:graphic xmlns:a="http://schemas.openxmlformats.org/drawingml/2006/main">
+              <a:graphicData uri="http://schemas.openxmlformats.org/drawingml/2006/picture">
+                <pic:pic xmlns:pic="http://schemas.openxmlformats.org/drawingml/2006/picture">
+                  <pic:nvPicPr>
+                    <pic:cNvPr id="1658686537" name=""/>
+                    <pic:cNvPicPr/>
+                  </pic:nvPicPr>
+                  <pic:blipFill>
+                    <a:blip r:embed="rId30"/>
+                    <a:stretch>
+                      <a:fillRect/>
+                    </a:stretch>
+                  </pic:blipFill>
+                  <pic:spPr>
+                    <a:xfrm>
+                      <a:off x="0" y="0"/>
+                      <a:ext cx="5731510" cy="2442845"/>
+                    </a:xfrm>
+                    <a:prstGeom prst="rect">
+                      <a:avLst/>
+                    </a:prstGeom>
+                  </pic:spPr>
+                </pic:pic>
+              </a:graphicData>
+            </a:graphic>
+          </wp:inline>
+        </w:drawing>
+      </w:r>
+    </w:p>
+    <w:p>
+      <w:pPr>
+        <w:rPr>
+          <w:b/>
+          <w:bCs/>
+        </w:rPr>
+      </w:pPr>
     </w:p>
     <w:p>
       <w:pPr>
@@ -2141,7 +2779,7 @@
                     <pic:cNvPicPr/>
                   </pic:nvPicPr>
                   <pic:blipFill>
-                    <a:blip r:embed="rId24"/>
+                    <a:blip r:embed="rId31"/>
                     <a:stretch>
                       <a:fillRect/>
                     </a:stretch>
@@ -2246,6 +2884,7 @@
         <w:rPr>
           <w:b/>
           <w:bCs/>
+          <w:noProof/>
         </w:rPr>
         <w:drawing>
           <wp:inline distT="0" distB="0" distL="0" distR="0" wp14:anchorId="1FF87212" wp14:editId="400659FD">
@@ -2263,7 +2902,7 @@
                     <pic:cNvPicPr/>
                   </pic:nvPicPr>
                   <pic:blipFill>
-                    <a:blip r:embed="rId25"/>
+                    <a:blip r:embed="rId32"/>
                     <a:stretch>
                       <a:fillRect/>
                     </a:stretch>
@@ -2318,6 +2957,7 @@
         <w:rPr>
           <w:b/>
           <w:bCs/>
+          <w:noProof/>
         </w:rPr>
         <w:drawing>
           <wp:inline distT="0" distB="0" distL="0" distR="0" wp14:anchorId="122E89D5" wp14:editId="1AEDC0F2">
@@ -2335,7 +2975,7 @@
                     <pic:cNvPicPr/>
                   </pic:nvPicPr>
                   <pic:blipFill>
-                    <a:blip r:embed="rId26"/>
+                    <a:blip r:embed="rId33"/>
                     <a:stretch>
                       <a:fillRect/>
                     </a:stretch>
@@ -2408,7 +3048,7 @@
                     <pic:cNvPicPr/>
                   </pic:nvPicPr>
                   <pic:blipFill>
-                    <a:blip r:embed="rId27"/>
+                    <a:blip r:embed="rId34"/>
                     <a:stretch>
                       <a:fillRect/>
                     </a:stretch>
@@ -2569,7 +3209,7 @@
                     <pic:cNvPicPr/>
                   </pic:nvPicPr>
                   <pic:blipFill>
-                    <a:blip r:embed="rId28"/>
+                    <a:blip r:embed="rId35"/>
                     <a:stretch>
                       <a:fillRect/>
                     </a:stretch>
@@ -2658,7 +3298,7 @@
                     <pic:cNvPicPr/>
                   </pic:nvPicPr>
                   <pic:blipFill>
-                    <a:blip r:embed="rId29"/>
+                    <a:blip r:embed="rId36"/>
                     <a:stretch>
                       <a:fillRect/>
                     </a:stretch>
@@ -2716,7 +3356,7 @@
                     <pic:cNvPicPr/>
                   </pic:nvPicPr>
                   <pic:blipFill>
-                    <a:blip r:embed="rId30"/>
+                    <a:blip r:embed="rId37"/>
                     <a:stretch>
                       <a:fillRect/>
                     </a:stretch>
@@ -2766,7 +3406,7 @@
                     <pic:cNvPicPr/>
                   </pic:nvPicPr>
                   <pic:blipFill>
-                    <a:blip r:embed="rId31"/>
+                    <a:blip r:embed="rId38"/>
                     <a:stretch>
                       <a:fillRect/>
                     </a:stretch>
@@ -2817,7 +3457,7 @@
                     <pic:cNvPicPr/>
                   </pic:nvPicPr>
                   <pic:blipFill>
-                    <a:blip r:embed="rId32"/>
+                    <a:blip r:embed="rId39"/>
                     <a:stretch>
                       <a:fillRect/>
                     </a:stretch>
@@ -2867,7 +3507,7 @@
                     <pic:cNvPicPr/>
                   </pic:nvPicPr>
                   <pic:blipFill>
-                    <a:blip r:embed="rId33"/>
+                    <a:blip r:embed="rId40"/>
                     <a:stretch>
                       <a:fillRect/>
                     </a:stretch>

</xml_diff>